<commit_message>
perf: docx 嵌入图压缩 (4.3MB -> 3.36MB) + 网络中断排查文档
用户 pull 遇到 Connection reset by peer（ref 锁问题已解决，转为网络问题）。
远端仓库验证正常，可正常 clone，最新 0608565。

优化传输量:
- 06_make_docx.py 增加 _shrink_png()，300dpi 原图等比缩到 1800px 再嵌入
- 四个 docx 合计 4.3MB -> 3.36MB，图片数量与清晰度均无损失
- 已验证 4 个文档完好、图片齐全、无缺图占位

新增 analysis/FIX_NETWORK.md:
- 分步 fetch+merge（可重试不伤工作区）
- http.version HTTP/1.1（对 Connection reset 最有效）
- 浅克隆 / SSH 切换 / 单目录检出 / 网页直载
- WSL 特有的 MTU 与 DNS 排查
- 四种 pull 失败对照表

Co-authored-by: arena-agent <297053741+arena-agent@users.noreply.github.com>
</commit_message>
<xml_diff>
--- a/analysis/GSE118767/docs/GSE118767_代码方法.docx
+++ b/analysis/GSE118767/docs/GSE118767_代码方法.docx
@@ -3883,7 +3883,7 @@
       <w:r>
         <w:drawing>
           <wp:inline xmlns:a="http://schemas.openxmlformats.org/drawingml/2006/main" xmlns:pic="http://schemas.openxmlformats.org/drawingml/2006/picture">
-            <wp:extent cx="5400000" cy="2523403"/>
+            <wp:extent cx="5400000" cy="2523000"/>
             <wp:docPr id="1" name="Picture 1"/>
             <wp:cNvGraphicFramePr>
               <a:graphicFrameLocks noChangeAspect="1"/>
@@ -3892,7 +3892,7 @@
               <a:graphicData uri="http://schemas.openxmlformats.org/drawingml/2006/picture">
                 <pic:pic>
                   <pic:nvPicPr>
-                    <pic:cNvPr id="0" name="fig03_resolution_sweep.png"/>
+                    <pic:cNvPr id="0" name="docximg_b1857be1.png"/>
                     <pic:cNvPicPr/>
                   </pic:nvPicPr>
                   <pic:blipFill>
@@ -3904,7 +3904,7 @@
                   <pic:spPr>
                     <a:xfrm>
                       <a:off x="0" y="0"/>
-                      <a:ext cx="5400000" cy="2523403"/>
+                      <a:ext cx="5400000" cy="2523000"/>
                     </a:xfrm>
                     <a:prstGeom prst="rect"/>
                   </pic:spPr>
@@ -4386,7 +4386,7 @@
       <w:r>
         <w:drawing>
           <wp:inline xmlns:a="http://schemas.openxmlformats.org/drawingml/2006/main" xmlns:pic="http://schemas.openxmlformats.org/drawingml/2006/picture">
-            <wp:extent cx="5400000" cy="2090891"/>
+            <wp:extent cx="5400000" cy="2088000"/>
             <wp:docPr id="2" name="Picture 2"/>
             <wp:cNvGraphicFramePr>
               <a:graphicFrameLocks noChangeAspect="1"/>
@@ -4395,7 +4395,7 @@
               <a:graphicData uri="http://schemas.openxmlformats.org/drawingml/2006/picture">
                 <pic:pic>
                   <pic:nvPicPr>
-                    <pic:cNvPr id="0" name="fig06_subcluster_origin.png"/>
+                    <pic:cNvPr id="0" name="docximg_8b97bd5f.png"/>
                     <pic:cNvPicPr/>
                   </pic:nvPicPr>
                   <pic:blipFill>
@@ -4407,7 +4407,7 @@
                   <pic:spPr>
                     <a:xfrm>
                       <a:off x="0" y="0"/>
-                      <a:ext cx="5400000" cy="2090891"/>
+                      <a:ext cx="5400000" cy="2088000"/>
                     </a:xfrm>
                     <a:prstGeom prst="rect"/>
                   </pic:spPr>

</xml_diff>